<commit_message>
docs: update final exam group answer document
</commit_message>
<xml_diff>
--- a/final-exam/final-exam-group-answer.docx.docx
+++ b/final-exam/final-exam-group-answer.docx.docx
@@ -948,7 +948,22 @@
                 <w:rFonts w:ascii="TH SarabunPSK" w:hAnsi="TH SarabunPSK" w:cs="TH SarabunPSK"/>
                 <w:color w:val="5A6B7C"/>
               </w:rPr>
-              <w:t xml:space="preserve">SRS: ........ · W10: ........ · W11: ........ (commit </w:t>
+              <w:t>SRS: ...</w:t>
+            </w:r>
+            <w:r>
+              <w:rPr>
+                <w:rFonts w:ascii="TH SarabunPSK" w:hAnsi="TH SarabunPSK" w:cs="TH SarabunPSK" w:hint="cs"/>
+                <w:color w:val="5A6B7C"/>
+                <w:cs/>
+              </w:rPr>
+              <w:t>7</w:t>
+            </w:r>
+            <w:r>
+              <w:rPr>
+                <w:rFonts w:ascii="TH SarabunPSK" w:hAnsi="TH SarabunPSK" w:cs="TH SarabunPSK"/>
+                <w:color w:val="5A6B7C"/>
+              </w:rPr>
+              <w:t xml:space="preserve">..... · W10: ........ · W11: ........ (commit </w:t>
             </w:r>
             <w:proofErr w:type="spellStart"/>
             <w:r>
@@ -22545,7 +22560,7 @@
         <w:tblLook w:val="04A0" w:firstRow="1" w:lastRow="0" w:firstColumn="1" w:lastColumn="0" w:noHBand="0" w:noVBand="1"/>
       </w:tblPr>
       <w:tblGrid>
-        <w:gridCol w:w="15318"/>
+        <w:gridCol w:w="15730"/>
       </w:tblGrid>
       <w:tr>
         <w:trPr>
@@ -22585,10 +22600,10 @@
               </w:rPr>
               <w:lastRenderedPageBreak/>
               <w:drawing>
-                <wp:inline distT="0" distB="0" distL="0" distR="0" wp14:anchorId="389EDEF7" wp14:editId="3DAD7FF1">
-                  <wp:extent cx="8804910" cy="5717041"/>
-                  <wp:effectExtent l="0" t="0" r="0" b="0"/>
-                  <wp:docPr id="2" name="Picture 2"/>
+                <wp:inline distT="0" distB="0" distL="0" distR="0" wp14:anchorId="090E7077" wp14:editId="09FD2FCB">
+                  <wp:extent cx="9726930" cy="5816600"/>
+                  <wp:effectExtent l="0" t="0" r="7620" b="0"/>
+                  <wp:docPr id="3" name="Picture 3"/>
                   <wp:cNvGraphicFramePr>
                     <a:graphicFrameLocks xmlns:a="http://schemas.openxmlformats.org/drawingml/2006/main" noChangeAspect="1"/>
                   </wp:cNvGraphicFramePr>
@@ -22608,7 +22623,7 @@
                         <pic:spPr>
                           <a:xfrm>
                             <a:off x="0" y="0"/>
-                            <a:ext cx="8807548" cy="5718754"/>
+                            <a:ext cx="9726930" cy="5816600"/>
                           </a:xfrm>
                           <a:prstGeom prst="rect">
                             <a:avLst/>
@@ -22942,6 +22957,7 @@
                 <w:rFonts w:ascii="TH SarabunPSK" w:hAnsi="TH SarabunPSK" w:cs="TH SarabunPSK"/>
                 <w:i/>
                 <w:iCs/>
+                <w:noProof/>
                 <w:color w:val="8A99A8"/>
               </w:rPr>
               <w:drawing>
@@ -25319,7 +25335,7 @@
           <w:rFonts w:ascii="Segoe UI Symbol" w:eastAsia="Segoe UI Symbol" w:hAnsi="Segoe UI Symbol" w:cs="Segoe UI Symbol"/>
           <w:color w:val="5A6B7C"/>
         </w:rPr>
-        <w:t>☐</w:t>
+        <w:t>☑</w:t>
       </w:r>
       <w:r>
         <w:rPr>
@@ -25389,7 +25405,7 @@
           <w:rFonts w:ascii="Segoe UI Symbol" w:eastAsia="Segoe UI Symbol" w:hAnsi="Segoe UI Symbol" w:cs="Segoe UI Symbol"/>
           <w:color w:val="5A6B7C"/>
         </w:rPr>
-        <w:t>☐</w:t>
+        <w:t>☑</w:t>
       </w:r>
       <w:r>
         <w:rPr>
@@ -25451,7 +25467,7 @@
           <w:rFonts w:ascii="Segoe UI Symbol" w:eastAsia="Segoe UI Symbol" w:hAnsi="Segoe UI Symbol" w:cs="Segoe UI Symbol"/>
           <w:color w:val="5A6B7C"/>
         </w:rPr>
-        <w:t>☐</w:t>
+        <w:t>☑</w:t>
       </w:r>
       <w:r>
         <w:rPr>
@@ -25507,7 +25523,7 @@
           <w:rFonts w:ascii="Segoe UI Symbol" w:eastAsia="Segoe UI Symbol" w:hAnsi="Segoe UI Symbol" w:cs="Segoe UI Symbol"/>
           <w:color w:val="5A6B7C"/>
         </w:rPr>
-        <w:t>☐</w:t>
+        <w:t>☑</w:t>
       </w:r>
       <w:r>
         <w:rPr>
@@ -25577,7 +25593,7 @@
           <w:rFonts w:ascii="Segoe UI Symbol" w:eastAsia="Segoe UI Symbol" w:hAnsi="Segoe UI Symbol" w:cs="Segoe UI Symbol"/>
           <w:color w:val="5A6B7C"/>
         </w:rPr>
-        <w:t>☐</w:t>
+        <w:t>☑</w:t>
       </w:r>
       <w:r>
         <w:rPr>
@@ -25661,7 +25677,7 @@
           <w:rFonts w:ascii="Segoe UI Symbol" w:eastAsia="Segoe UI Symbol" w:hAnsi="Segoe UI Symbol" w:cs="Segoe UI Symbol"/>
           <w:color w:val="5A6B7C"/>
         </w:rPr>
-        <w:t>☐</w:t>
+        <w:t>☑</w:t>
       </w:r>
       <w:r>
         <w:rPr>
@@ -25883,6 +25899,32 @@
                 <w:rFonts w:ascii="TH SarabunPSK" w:hAnsi="TH SarabunPSK" w:cs="TH SarabunPSK"/>
               </w:rPr>
             </w:pPr>
+            <w:r>
+              <w:rPr>
+                <w:rFonts w:ascii="TH SarabunPSK" w:hAnsi="TH SarabunPSK" w:cs="TH SarabunPSK"/>
+              </w:rPr>
+              <w:t xml:space="preserve">Codex </w:t>
+            </w:r>
+            <w:r>
+              <w:rPr>
+                <w:rFonts w:ascii="TH SarabunPSK" w:hAnsi="TH SarabunPSK" w:cs="TH SarabunPSK"/>
+              </w:rPr>
+              <w:t>(</w:t>
+            </w:r>
+            <w:proofErr w:type="spellStart"/>
+            <w:r>
+              <w:rPr>
+                <w:rFonts w:ascii="TH SarabunPSK" w:hAnsi="TH SarabunPSK" w:cs="TH SarabunPSK"/>
+              </w:rPr>
+              <w:t>ChatGPT</w:t>
+            </w:r>
+            <w:proofErr w:type="spellEnd"/>
+            <w:r>
+              <w:rPr>
+                <w:rFonts w:ascii="TH SarabunPSK" w:hAnsi="TH SarabunPSK" w:cs="TH SarabunPSK"/>
+              </w:rPr>
+              <w:t>)</w:t>
+            </w:r>
           </w:p>
         </w:tc>
         <w:tc>
@@ -25905,9 +25947,43 @@
           <w:p>
             <w:pPr>
               <w:rPr>
-                <w:rFonts w:ascii="TH SarabunPSK" w:hAnsi="TH SarabunPSK" w:cs="TH SarabunPSK"/>
-              </w:rPr>
-            </w:pPr>
+                <w:rFonts w:ascii="TH SarabunPSK" w:hAnsi="TH SarabunPSK" w:cs="TH SarabunPSK" w:hint="cs"/>
+                <w:cs/>
+              </w:rPr>
+            </w:pPr>
+            <w:r>
+              <w:rPr>
+                <w:rFonts w:ascii="TH SarabunPSK" w:hAnsi="TH SarabunPSK" w:cs="TH SarabunPSK"/>
+                <w:cs/>
+              </w:rPr>
+              <w:t xml:space="preserve">ช่วยตรวจทานเอกสาร วิเคราะห์ความสอดคล้องของ </w:t>
+            </w:r>
+            <w:r>
+              <w:rPr>
+                <w:rFonts w:ascii="TH SarabunPSK" w:hAnsi="TH SarabunPSK" w:cs="TH SarabunPSK"/>
+              </w:rPr>
+              <w:t xml:space="preserve">Requirement, User Story, Acceptance Criteria </w:t>
+            </w:r>
+            <w:r>
+              <w:rPr>
+                <w:rFonts w:ascii="TH SarabunPSK" w:hAnsi="TH SarabunPSK" w:cs="TH SarabunPSK"/>
+                <w:cs/>
+              </w:rPr>
+              <w:t xml:space="preserve">และ </w:t>
+            </w:r>
+            <w:r>
+              <w:rPr>
+                <w:rFonts w:ascii="TH SarabunPSK" w:hAnsi="TH SarabunPSK" w:cs="TH SarabunPSK"/>
+              </w:rPr>
+              <w:t xml:space="preserve">Design </w:t>
+            </w:r>
+            <w:r>
+              <w:rPr>
+                <w:rFonts w:ascii="TH SarabunPSK" w:hAnsi="TH SarabunPSK" w:cs="TH SarabunPSK"/>
+                <w:cs/>
+              </w:rPr>
+              <w:t>รวมถึงเสนอแนวทางปรับปรุงเนื้อหา</w:t>
+            </w:r>
           </w:p>
         </w:tc>
         <w:tc>
@@ -25933,87 +26009,13 @@
                 <w:rFonts w:ascii="TH SarabunPSK" w:hAnsi="TH SarabunPSK" w:cs="TH SarabunPSK"/>
               </w:rPr>
             </w:pPr>
-          </w:p>
-        </w:tc>
-      </w:tr>
-      <w:tr>
-        <w:trPr>
-          <w:cantSplit/>
-          <w:trHeight w:val="680"/>
-        </w:trPr>
-        <w:tc>
-          <w:tcPr>
-            <w:tcW w:w="1927" w:type="dxa"/>
-            <w:tcBorders>
-              <w:top w:val="single" w:sz="4" w:space="0" w:color="C9D3DC"/>
-              <w:left w:val="single" w:sz="4" w:space="0" w:color="C9D3DC"/>
-              <w:bottom w:val="single" w:sz="4" w:space="0" w:color="C9D3DC"/>
-              <w:right w:val="single" w:sz="4" w:space="0" w:color="C9D3DC"/>
-            </w:tcBorders>
-            <w:shd w:val="clear" w:color="auto" w:fill="F1F7FA"/>
-            <w:tcMar>
-              <w:top w:w="40" w:type="dxa"/>
-              <w:left w:w="90" w:type="dxa"/>
-              <w:bottom w:w="40" w:type="dxa"/>
-              <w:right w:w="90" w:type="dxa"/>
-            </w:tcMar>
-          </w:tcPr>
-          <w:p>
-            <w:pPr>
-              <w:rPr>
-                <w:rFonts w:ascii="TH SarabunPSK" w:hAnsi="TH SarabunPSK" w:cs="TH SarabunPSK"/>
-              </w:rPr>
-            </w:pPr>
-          </w:p>
-        </w:tc>
-        <w:tc>
-          <w:tcPr>
-            <w:tcW w:w="3855" w:type="dxa"/>
-            <w:tcBorders>
-              <w:top w:val="single" w:sz="4" w:space="0" w:color="C9D3DC"/>
-              <w:left w:val="single" w:sz="4" w:space="0" w:color="C9D3DC"/>
-              <w:bottom w:val="single" w:sz="4" w:space="0" w:color="C9D3DC"/>
-              <w:right w:val="single" w:sz="4" w:space="0" w:color="C9D3DC"/>
-            </w:tcBorders>
-            <w:shd w:val="clear" w:color="auto" w:fill="F1F7FA"/>
-            <w:tcMar>
-              <w:top w:w="40" w:type="dxa"/>
-              <w:left w:w="90" w:type="dxa"/>
-              <w:bottom w:w="40" w:type="dxa"/>
-              <w:right w:w="90" w:type="dxa"/>
-            </w:tcMar>
-          </w:tcPr>
-          <w:p>
-            <w:pPr>
-              <w:rPr>
-                <w:rFonts w:ascii="TH SarabunPSK" w:hAnsi="TH SarabunPSK" w:cs="TH SarabunPSK"/>
-              </w:rPr>
-            </w:pPr>
-          </w:p>
-        </w:tc>
-        <w:tc>
-          <w:tcPr>
-            <w:tcW w:w="3856" w:type="dxa"/>
-            <w:tcBorders>
-              <w:top w:val="single" w:sz="4" w:space="0" w:color="C9D3DC"/>
-              <w:left w:val="single" w:sz="4" w:space="0" w:color="C9D3DC"/>
-              <w:bottom w:val="single" w:sz="4" w:space="0" w:color="C9D3DC"/>
-              <w:right w:val="single" w:sz="4" w:space="0" w:color="C9D3DC"/>
-            </w:tcBorders>
-            <w:shd w:val="clear" w:color="auto" w:fill="F1F7FA"/>
-            <w:tcMar>
-              <w:top w:w="40" w:type="dxa"/>
-              <w:left w:w="90" w:type="dxa"/>
-              <w:bottom w:w="40" w:type="dxa"/>
-              <w:right w:w="90" w:type="dxa"/>
-            </w:tcMar>
-          </w:tcPr>
-          <w:p>
-            <w:pPr>
-              <w:rPr>
-                <w:rFonts w:ascii="TH SarabunPSK" w:hAnsi="TH SarabunPSK" w:cs="TH SarabunPSK"/>
-              </w:rPr>
-            </w:pPr>
+            <w:r>
+              <w:rPr>
+                <w:rFonts w:ascii="TH SarabunPSK" w:hAnsi="TH SarabunPSK" w:cs="TH SarabunPSK"/>
+                <w:cs/>
+              </w:rPr>
+              <w:t>เปรียบเทียบคำแนะนำกับโจทย์และเอกสารต้นฉบับ ตรวจสอบว่าเนื้อหาไม่ขัดแย้งกัน และพิจารณาปรับแก้ด้วยตนเอง</w:t>
+            </w:r>
           </w:p>
         </w:tc>
       </w:tr>
@@ -26029,6 +26031,20 @@
       <w:pPr>
         <w:rPr>
           <w:rFonts w:ascii="TH SarabunPSK" w:hAnsi="TH SarabunPSK" w:cs="TH SarabunPSK"/>
+        </w:rPr>
+      </w:pPr>
+    </w:p>
+    <w:p>
+      <w:pPr>
+        <w:rPr>
+          <w:rFonts w:ascii="TH SarabunPSK" w:hAnsi="TH SarabunPSK" w:cs="TH SarabunPSK" w:hint="cs"/>
+        </w:rPr>
+      </w:pPr>
+    </w:p>
+    <w:p>
+      <w:pPr>
+        <w:rPr>
+          <w:rFonts w:ascii="TH SarabunPSK" w:hAnsi="TH SarabunPSK" w:cs="TH SarabunPSK"/>
           <w:b/>
           <w:bCs/>
         </w:rPr>
@@ -26039,6 +26055,7 @@
           <w:b/>
           <w:bCs/>
         </w:rPr>
+        <w:lastRenderedPageBreak/>
         <w:t xml:space="preserve">6.3 </w:t>
       </w:r>
       <w:proofErr w:type="spellStart"/>
@@ -26109,7 +26126,6 @@
                 <w:rFonts w:ascii="TH SarabunPSK" w:hAnsi="TH SarabunPSK" w:cs="TH SarabunPSK"/>
                 <w:color w:val="FFFFFF"/>
               </w:rPr>
-              <w:lastRenderedPageBreak/>
               <w:t>สมาชิก</w:t>
             </w:r>
             <w:proofErr w:type="spellEnd"/>
@@ -26297,8 +26313,24 @@
             <w:pPr>
               <w:rPr>
                 <w:rFonts w:ascii="TH SarabunPSK" w:hAnsi="TH SarabunPSK" w:cs="TH SarabunPSK"/>
-              </w:rPr>
-            </w:pPr>
+                <w:color w:val="auto"/>
+              </w:rPr>
+            </w:pPr>
+            <w:r>
+              <w:rPr>
+                <w:rFonts w:ascii="TH SarabunPSK" w:hAnsi="TH SarabunPSK" w:cs="TH SarabunPSK"/>
+                <w:color w:val="auto"/>
+              </w:rPr>
+              <w:t xml:space="preserve">1) </w:t>
+            </w:r>
+            <w:r>
+              <w:rPr>
+                <w:rFonts w:ascii="TH SarabunPSK" w:hAnsi="TH SarabunPSK" w:cs="TH SarabunPSK"/>
+                <w:color w:val="auto"/>
+                <w:cs/>
+              </w:rPr>
+              <w:t xml:space="preserve">นาย นนทชัย ไทยตัน </w:t>
+            </w:r>
           </w:p>
         </w:tc>
         <w:tc>
@@ -26320,10 +26352,45 @@
           </w:tcPr>
           <w:p>
             <w:pPr>
-              <w:rPr>
-                <w:rFonts w:ascii="TH SarabunPSK" w:hAnsi="TH SarabunPSK" w:cs="TH SarabunPSK"/>
-              </w:rPr>
-            </w:pPr>
+              <w:tabs>
+                <w:tab w:val="left" w:pos="1080"/>
+              </w:tabs>
+              <w:rPr>
+                <w:rFonts w:ascii="TH SarabunPSK" w:hAnsi="TH SarabunPSK" w:cs="TH SarabunPSK"/>
+              </w:rPr>
+            </w:pPr>
+            <w:r>
+              <w:rPr>
+                <w:rFonts w:ascii="TH SarabunPSK" w:hAnsi="TH SarabunPSK" w:cs="TH SarabunPSK"/>
+              </w:rPr>
+              <w:t>G</w:t>
+            </w:r>
+            <w:r>
+              <w:rPr>
+                <w:rFonts w:ascii="TH SarabunPSK" w:hAnsi="TH SarabunPSK" w:cs="TH SarabunPSK"/>
+                <w:cs/>
+              </w:rPr>
+              <w:t>1</w:t>
+            </w:r>
+            <w:r>
+              <w:rPr>
+                <w:rFonts w:ascii="TH SarabunPSK" w:hAnsi="TH SarabunPSK" w:cs="TH SarabunPSK"/>
+              </w:rPr>
+              <w:t>, G</w:t>
+            </w:r>
+            <w:r>
+              <w:rPr>
+                <w:rFonts w:ascii="TH SarabunPSK" w:hAnsi="TH SarabunPSK" w:cs="TH SarabunPSK"/>
+                <w:cs/>
+              </w:rPr>
+              <w:t xml:space="preserve">2 และ </w:t>
+            </w:r>
+            <w:r>
+              <w:rPr>
+                <w:rFonts w:ascii="TH SarabunPSK" w:hAnsi="TH SarabunPSK" w:cs="TH SarabunPSK"/>
+              </w:rPr>
+              <w:t>SRS trace</w:t>
+            </w:r>
           </w:p>
         </w:tc>
         <w:tc>
@@ -26349,6 +26416,46 @@
                 <w:rFonts w:ascii="TH SarabunPSK" w:hAnsi="TH SarabunPSK" w:cs="TH SarabunPSK"/>
               </w:rPr>
             </w:pPr>
+            <w:r>
+              <w:rPr>
+                <w:rFonts w:ascii="TH SarabunPSK" w:hAnsi="TH SarabunPSK" w:cs="TH SarabunPSK"/>
+              </w:rPr>
+              <w:t>`docs/</w:t>
+            </w:r>
+            <w:r>
+              <w:rPr>
+                <w:rFonts w:ascii="TH SarabunPSK" w:hAnsi="TH SarabunPSK" w:cs="TH SarabunPSK"/>
+                <w:cs/>
+              </w:rPr>
+              <w:t>07-</w:t>
+            </w:r>
+            <w:proofErr w:type="spellStart"/>
+            <w:r>
+              <w:rPr>
+                <w:rFonts w:ascii="TH SarabunPSK" w:hAnsi="TH SarabunPSK" w:cs="TH SarabunPSK"/>
+              </w:rPr>
+              <w:t>srs</w:t>
+            </w:r>
+            <w:proofErr w:type="spellEnd"/>
+            <w:r>
+              <w:rPr>
+                <w:rFonts w:ascii="TH SarabunPSK" w:hAnsi="TH SarabunPSK" w:cs="TH SarabunPSK"/>
+              </w:rPr>
+              <w:t>-v</w:t>
+            </w:r>
+            <w:r>
+              <w:rPr>
+                <w:rFonts w:ascii="TH SarabunPSK" w:hAnsi="TH SarabunPSK" w:cs="TH SarabunPSK"/>
+                <w:cs/>
+              </w:rPr>
+              <w:t>1.</w:t>
+            </w:r>
+            <w:r>
+              <w:rPr>
+                <w:rFonts w:ascii="TH SarabunPSK" w:hAnsi="TH SarabunPSK" w:cs="TH SarabunPSK"/>
+              </w:rPr>
+              <w:t>md`</w:t>
+            </w:r>
           </w:p>
         </w:tc>
       </w:tr>
@@ -26378,8 +26485,42 @@
             <w:pPr>
               <w:rPr>
                 <w:rFonts w:ascii="TH SarabunPSK" w:hAnsi="TH SarabunPSK" w:cs="TH SarabunPSK"/>
-              </w:rPr>
-            </w:pPr>
+                <w:color w:val="auto"/>
+              </w:rPr>
+            </w:pPr>
+            <w:r>
+              <w:rPr>
+                <w:rFonts w:ascii="TH SarabunPSK" w:hAnsi="TH SarabunPSK" w:cs="TH SarabunPSK"/>
+                <w:color w:val="auto"/>
+              </w:rPr>
+              <w:t xml:space="preserve">2) </w:t>
+            </w:r>
+            <w:r>
+              <w:rPr>
+                <w:rFonts w:ascii="TH SarabunPSK" w:hAnsi="TH SarabunPSK" w:cs="TH SarabunPSK"/>
+                <w:color w:val="auto"/>
+                <w:cs/>
+              </w:rPr>
+              <w:t>นาย ภู</w:t>
+            </w:r>
+            <w:proofErr w:type="spellStart"/>
+            <w:r>
+              <w:rPr>
+                <w:rFonts w:ascii="TH SarabunPSK" w:hAnsi="TH SarabunPSK" w:cs="TH SarabunPSK"/>
+                <w:color w:val="auto"/>
+                <w:cs/>
+              </w:rPr>
+              <w:t>มิพัฒน์</w:t>
+            </w:r>
+            <w:proofErr w:type="spellEnd"/>
+            <w:r>
+              <w:rPr>
+                <w:rFonts w:ascii="TH SarabunPSK" w:hAnsi="TH SarabunPSK" w:cs="TH SarabunPSK"/>
+                <w:color w:val="auto"/>
+                <w:cs/>
+              </w:rPr>
+              <w:t xml:space="preserve"> วงศ์ดาว</w:t>
+            </w:r>
           </w:p>
         </w:tc>
         <w:tc>
@@ -26405,6 +26546,38 @@
                 <w:rFonts w:ascii="TH SarabunPSK" w:hAnsi="TH SarabunPSK" w:cs="TH SarabunPSK"/>
               </w:rPr>
             </w:pPr>
+            <w:r>
+              <w:rPr>
+                <w:rFonts w:ascii="TH SarabunPSK" w:hAnsi="TH SarabunPSK" w:cs="TH SarabunPSK"/>
+              </w:rPr>
+              <w:t>G</w:t>
+            </w:r>
+            <w:r>
+              <w:rPr>
+                <w:rFonts w:ascii="TH SarabunPSK" w:hAnsi="TH SarabunPSK" w:cs="TH SarabunPSK"/>
+                <w:cs/>
+              </w:rPr>
+              <w:t>3</w:t>
+            </w:r>
+            <w:r>
+              <w:rPr>
+                <w:rFonts w:ascii="TH SarabunPSK" w:hAnsi="TH SarabunPSK" w:cs="TH SarabunPSK"/>
+              </w:rPr>
+              <w:t>, G</w:t>
+            </w:r>
+            <w:r>
+              <w:rPr>
+                <w:rFonts w:ascii="TH SarabunPSK" w:hAnsi="TH SarabunPSK" w:cs="TH SarabunPSK"/>
+                <w:cs/>
+              </w:rPr>
+              <w:t xml:space="preserve">4 และ </w:t>
+            </w:r>
+            <w:r>
+              <w:rPr>
+                <w:rFonts w:ascii="TH SarabunPSK" w:hAnsi="TH SarabunPSK" w:cs="TH SarabunPSK"/>
+              </w:rPr>
+              <w:t>Design Spine</w:t>
+            </w:r>
           </w:p>
         </w:tc>
         <w:tc>
@@ -26430,6 +26603,25 @@
                 <w:rFonts w:ascii="TH SarabunPSK" w:hAnsi="TH SarabunPSK" w:cs="TH SarabunPSK"/>
               </w:rPr>
             </w:pPr>
+            <w:r>
+              <w:rPr>
+                <w:rFonts w:ascii="TH SarabunPSK" w:hAnsi="TH SarabunPSK" w:cs="TH SarabunPSK"/>
+              </w:rPr>
+              <w:t>`design/</w:t>
+            </w:r>
+            <w:r>
+              <w:rPr>
+                <w:rFonts w:ascii="TH SarabunPSK" w:hAnsi="TH SarabunPSK" w:cs="TH SarabunPSK"/>
+                <w:cs/>
+              </w:rPr>
+              <w:t>10-</w:t>
+            </w:r>
+            <w:r>
+              <w:rPr>
+                <w:rFonts w:ascii="TH SarabunPSK" w:hAnsi="TH SarabunPSK" w:cs="TH SarabunPSK"/>
+              </w:rPr>
+              <w:t>design-strategy.md`</w:t>
+            </w:r>
           </w:p>
         </w:tc>
       </w:tr>
@@ -26459,8 +26651,24 @@
             <w:pPr>
               <w:rPr>
                 <w:rFonts w:ascii="TH SarabunPSK" w:hAnsi="TH SarabunPSK" w:cs="TH SarabunPSK"/>
-              </w:rPr>
-            </w:pPr>
+                <w:color w:val="auto"/>
+              </w:rPr>
+            </w:pPr>
+            <w:r>
+              <w:rPr>
+                <w:rFonts w:ascii="TH SarabunPSK" w:hAnsi="TH SarabunPSK" w:cs="TH SarabunPSK"/>
+                <w:color w:val="auto"/>
+              </w:rPr>
+              <w:t>3)</w:t>
+            </w:r>
+            <w:r>
+              <w:rPr>
+                <w:rFonts w:ascii="TH SarabunPSK" w:hAnsi="TH SarabunPSK" w:cs="TH SarabunPSK"/>
+                <w:color w:val="auto"/>
+                <w:cs/>
+              </w:rPr>
+              <w:t xml:space="preserve"> นางสาว ณัฐณิชา ปกแก้ว</w:t>
+            </w:r>
           </w:p>
         </w:tc>
         <w:tc>
@@ -26486,6 +26694,32 @@
                 <w:rFonts w:ascii="TH SarabunPSK" w:hAnsi="TH SarabunPSK" w:cs="TH SarabunPSK"/>
               </w:rPr>
             </w:pPr>
+            <w:r>
+              <w:rPr>
+                <w:rFonts w:ascii="TH SarabunPSK" w:hAnsi="TH SarabunPSK" w:cs="TH SarabunPSK"/>
+              </w:rPr>
+              <w:t>G</w:t>
+            </w:r>
+            <w:r>
+              <w:rPr>
+                <w:rFonts w:ascii="TH SarabunPSK" w:hAnsi="TH SarabunPSK" w:cs="TH SarabunPSK"/>
+                <w:cs/>
+              </w:rPr>
+              <w:t>5</w:t>
+            </w:r>
+            <w:r>
+              <w:rPr>
+                <w:rFonts w:ascii="TH SarabunPSK" w:hAnsi="TH SarabunPSK" w:cs="TH SarabunPSK"/>
+              </w:rPr>
+              <w:t>, G</w:t>
+            </w:r>
+            <w:r>
+              <w:rPr>
+                <w:rFonts w:ascii="TH SarabunPSK" w:hAnsi="TH SarabunPSK" w:cs="TH SarabunPSK"/>
+                <w:cs/>
+              </w:rPr>
+              <w:t>6 และประสานงาน</w:t>
+            </w:r>
           </w:p>
         </w:tc>
         <w:tc>
@@ -26511,87 +26745,12 @@
                 <w:rFonts w:ascii="TH SarabunPSK" w:hAnsi="TH SarabunPSK" w:cs="TH SarabunPSK"/>
               </w:rPr>
             </w:pPr>
-          </w:p>
-        </w:tc>
-      </w:tr>
-      <w:tr>
-        <w:trPr>
-          <w:cantSplit/>
-          <w:trHeight w:val="624"/>
-        </w:trPr>
-        <w:tc>
-          <w:tcPr>
-            <w:tcW w:w="2891" w:type="dxa"/>
-            <w:tcBorders>
-              <w:top w:val="single" w:sz="4" w:space="0" w:color="C9D3DC"/>
-              <w:left w:val="single" w:sz="4" w:space="0" w:color="C9D3DC"/>
-              <w:bottom w:val="single" w:sz="4" w:space="0" w:color="C9D3DC"/>
-              <w:right w:val="single" w:sz="4" w:space="0" w:color="C9D3DC"/>
-            </w:tcBorders>
-            <w:shd w:val="clear" w:color="auto" w:fill="F1F7FA"/>
-            <w:tcMar>
-              <w:top w:w="40" w:type="dxa"/>
-              <w:left w:w="90" w:type="dxa"/>
-              <w:bottom w:w="40" w:type="dxa"/>
-              <w:right w:w="90" w:type="dxa"/>
-            </w:tcMar>
-          </w:tcPr>
-          <w:p>
-            <w:pPr>
-              <w:rPr>
-                <w:rFonts w:ascii="TH SarabunPSK" w:hAnsi="TH SarabunPSK" w:cs="TH SarabunPSK"/>
-              </w:rPr>
-            </w:pPr>
-          </w:p>
-        </w:tc>
-        <w:tc>
-          <w:tcPr>
-            <w:tcW w:w="3373" w:type="dxa"/>
-            <w:tcBorders>
-              <w:top w:val="single" w:sz="4" w:space="0" w:color="C9D3DC"/>
-              <w:left w:val="single" w:sz="4" w:space="0" w:color="C9D3DC"/>
-              <w:bottom w:val="single" w:sz="4" w:space="0" w:color="C9D3DC"/>
-              <w:right w:val="single" w:sz="4" w:space="0" w:color="C9D3DC"/>
-            </w:tcBorders>
-            <w:shd w:val="clear" w:color="auto" w:fill="F1F7FA"/>
-            <w:tcMar>
-              <w:top w:w="40" w:type="dxa"/>
-              <w:left w:w="90" w:type="dxa"/>
-              <w:bottom w:w="40" w:type="dxa"/>
-              <w:right w:w="90" w:type="dxa"/>
-            </w:tcMar>
-          </w:tcPr>
-          <w:p>
-            <w:pPr>
-              <w:rPr>
-                <w:rFonts w:ascii="TH SarabunPSK" w:hAnsi="TH SarabunPSK" w:cs="TH SarabunPSK"/>
-              </w:rPr>
-            </w:pPr>
-          </w:p>
-        </w:tc>
-        <w:tc>
-          <w:tcPr>
-            <w:tcW w:w="3374" w:type="dxa"/>
-            <w:tcBorders>
-              <w:top w:val="single" w:sz="4" w:space="0" w:color="C9D3DC"/>
-              <w:left w:val="single" w:sz="4" w:space="0" w:color="C9D3DC"/>
-              <w:bottom w:val="single" w:sz="4" w:space="0" w:color="C9D3DC"/>
-              <w:right w:val="single" w:sz="4" w:space="0" w:color="C9D3DC"/>
-            </w:tcBorders>
-            <w:shd w:val="clear" w:color="auto" w:fill="F1F7FA"/>
-            <w:tcMar>
-              <w:top w:w="40" w:type="dxa"/>
-              <w:left w:w="90" w:type="dxa"/>
-              <w:bottom w:w="40" w:type="dxa"/>
-              <w:right w:w="90" w:type="dxa"/>
-            </w:tcMar>
-          </w:tcPr>
-          <w:p>
-            <w:pPr>
-              <w:rPr>
-                <w:rFonts w:ascii="TH SarabunPSK" w:hAnsi="TH SarabunPSK" w:cs="TH SarabunPSK"/>
-              </w:rPr>
-            </w:pPr>
+            <w:r>
+              <w:rPr>
+                <w:rFonts w:ascii="TH SarabunPSK" w:hAnsi="TH SarabunPSK" w:cs="TH SarabunPSK"/>
+              </w:rPr>
+              <w:t>`final-exam/`</w:t>
+            </w:r>
           </w:p>
         </w:tc>
       </w:tr>
@@ -26673,7 +26832,24 @@
           <w:b/>
           <w:bCs/>
         </w:rPr>
-        <w:t xml:space="preserve"> oral spot-check  ( ) </w:t>
+        <w:t xml:space="preserve"> oral spot-check  (</w:t>
+      </w:r>
+      <w:r>
+        <w:rPr>
+          <w:rFonts w:ascii="TH SarabunPSK" w:hAnsi="TH SarabunPSK" w:cs="TH SarabunPSK" w:hint="cs"/>
+          <w:b/>
+          <w:bCs/>
+          <w:cs/>
+        </w:rPr>
+        <w:t>/</w:t>
+      </w:r>
+      <w:r>
+        <w:rPr>
+          <w:rFonts w:ascii="TH SarabunPSK" w:hAnsi="TH SarabunPSK" w:cs="TH SarabunPSK"/>
+          <w:b/>
+          <w:bCs/>
+        </w:rPr>
+        <w:t xml:space="preserve">) </w:t>
       </w:r>
       <w:proofErr w:type="spellStart"/>
       <w:r>

</xml_diff>